<commit_message>
Phase 1 score table released
</commit_message>
<xml_diff>
--- a/8051 Phase/B306 大一招新 各种说明和第二阶段规划.docx
+++ b/8051 Phase/B306 大一招新 各种说明和第二阶段规划.docx
@@ -127,6 +127,26 @@
         </w:rPr>
         <w:t>C语言阶段的考核已经结束了，分数表和此阶段的最终筛选结果已发布。</w:t>
       </w:r>
+      <w:r>
+        <w:rPr>
+          <w:rFonts w:hint="eastAsia"/>
+        </w:rPr>
+        <w:t>分数表中，</w:t>
+      </w:r>
+      <w:r>
+        <w:rPr>
+          <w:rFonts w:hint="eastAsia"/>
+          <w:b/>
+          <w:bCs/>
+        </w:rPr>
+        <w:t>最终成绩/序号</w:t>
+      </w:r>
+      <w:r>
+        <w:rPr>
+          <w:rFonts w:hint="eastAsia"/>
+        </w:rPr>
+        <w:t>标记颜色为绿色，表明你已通过此阶段考核。</w:t>
+      </w:r>
     </w:p>
     <w:p>
       <w:pPr>
@@ -632,6 +652,7 @@
         <w:rPr>
           <w:rFonts w:hint="eastAsia"/>
         </w:rPr>
+        <w:lastRenderedPageBreak/>
         <w:t>2026.10.26 - 2026.11.29</w:t>
       </w:r>
       <w:r>
@@ -679,7 +700,6 @@
         <w:rPr>
           <w:rFonts w:hint="eastAsia"/>
         </w:rPr>
-        <w:lastRenderedPageBreak/>
         <w:t xml:space="preserve">2026.11.30 </w:t>
       </w:r>
       <w:r>
@@ -3427,6 +3447,7 @@
   <w:style w:type="character" w:default="1" w:styleId="a0">
     <w:name w:val="Default Paragraph Font"/>
     <w:uiPriority w:val="1"/>
+    <w:semiHidden/>
     <w:unhideWhenUsed/>
   </w:style>
   <w:style w:type="table" w:default="1" w:styleId="a1">

</xml_diff>